<commit_message>
feat: phase 06d OCR adapter, engine format dispatch, render + OCR queue, uploads
Core OCR adapter (markers, regions, page noise) + page confidence; DOCX heading
cue and reconstructed-numbering note, DOCX via @aduin/core/docx subpath (keeps
Worker bundle +236 B); engine worker dispatch html/pdf/docx/ocr with magic-byte
check; main-thread page render (JPEG only, EXIF stripped) and OCR queue
(precompute -> Dexie -> /api/ocr, never PDF); uploads accept pdf/docx/jpg/png.

Co-Authored-By: Claude Opus 5.5 <noreply@anthropic.com>
</commit_message>
<xml_diff>
--- a/fixtures/docx/legal-numbering.docx
+++ b/fixtures/docx/legal-numbering.docx
@@ -52,6 +52,18 @@
       </w:pPr>
       <w:r>
         <w:t xml:space="preserve">References to Sections are to Sections of this Agreement.</w:t>
+      </w:r>
+    </w:p>
+    <w:p>
+      <w:pPr>
+        <w:pStyle w:val="ListParagraph"/>
+        <w:numPr>
+          <w:ilvl w:val="1"/>
+          <w:numId w:val="2"/>
+        </w:numPr>
+      </w:pPr>
+      <w:r>
+        <w:t xml:space="preserve">The undertakings in this Section 2 bind each Subscriber.</w:t>
       </w:r>
     </w:p>
     <w:p>

</xml_diff>